<commit_message>
core (Spring Security/Dtos/Controllers): Configuration of Spring Security, allow auth routes and learning about security
</commit_message>
<xml_diff>
--- a/frontend/documents/project-management-document.docx
+++ b/frontend/documents/project-management-document.docx
@@ -21,11 +21,6 @@
           <w:rFonts w:ascii="Poppins" w:hAnsi="Poppins" w:cs="Poppins"/>
         </w:rPr>
         <w:br/>
-      </w:r>
-      <w:r>
-        <w:rPr>
-          <w:rFonts w:ascii="Poppins" w:hAnsi="Poppins" w:cs="Poppins"/>
-        </w:rPr>
         <w:t>Pequenas equipes precisam de uma forma simples de organizar projetos e acompanhar seu status.</w:t>
       </w:r>
     </w:p>
@@ -114,11 +109,6 @@
           <w:rFonts w:ascii="Poppins" w:hAnsi="Poppins" w:cs="Poppins"/>
         </w:rPr>
         <w:br/>
-      </w:r>
-      <w:r>
-        <w:rPr>
-          <w:rFonts w:ascii="Poppins" w:hAnsi="Poppins" w:cs="Poppins"/>
-        </w:rPr>
         <w:t>- Criar conta</w:t>
       </w:r>
     </w:p>
@@ -253,22 +243,48 @@
       <w:pPr>
         <w:rPr>
           <w:rFonts w:ascii="Poppins" w:hAnsi="Poppins" w:cs="Poppins"/>
-        </w:rPr>
-      </w:pPr>
-      <w:r>
-        <w:rPr>
-          <w:rFonts w:ascii="Poppins" w:hAnsi="Poppins" w:cs="Poppins"/>
-        </w:rPr>
-        <w:t xml:space="preserve">- Listar projetos da </w:t>
+          <w:lang w:val="en-US"/>
+        </w:rPr>
+      </w:pPr>
+      <w:r>
+        <w:rPr>
+          <w:rFonts w:ascii="Poppins" w:hAnsi="Poppins" w:cs="Poppins"/>
+          <w:lang w:val="en-US"/>
+        </w:rPr>
+        <w:t xml:space="preserve">- </w:t>
       </w:r>
       <w:proofErr w:type="spellStart"/>
       <w:r>
         <w:rPr>
           <w:rFonts w:ascii="Poppins" w:hAnsi="Poppins" w:cs="Poppins"/>
-        </w:rPr>
-        <w:t>workspace</w:t>
+          <w:lang w:val="en-US"/>
+        </w:rPr>
+        <w:t>Listar</w:t>
       </w:r>
       <w:proofErr w:type="spellEnd"/>
+      <w:r>
+        <w:rPr>
+          <w:rFonts w:ascii="Poppins" w:hAnsi="Poppins" w:cs="Poppins"/>
+          <w:lang w:val="en-US"/>
+        </w:rPr>
+        <w:t xml:space="preserve"> </w:t>
+      </w:r>
+      <w:proofErr w:type="spellStart"/>
+      <w:r>
+        <w:rPr>
+          <w:rFonts w:ascii="Poppins" w:hAnsi="Poppins" w:cs="Poppins"/>
+          <w:lang w:val="en-US"/>
+        </w:rPr>
+        <w:t>projetos</w:t>
+      </w:r>
+      <w:proofErr w:type="spellEnd"/>
+      <w:r>
+        <w:rPr>
+          <w:rFonts w:ascii="Poppins" w:hAnsi="Poppins" w:cs="Poppins"/>
+          <w:lang w:val="en-US"/>
+        </w:rPr>
+        <w:t xml:space="preserve"> da workspace</w:t>
+      </w:r>
     </w:p>
     <w:p>
       <w:pPr>
@@ -2049,6 +2065,7 @@
   <w:style w:type="character" w:default="1" w:styleId="Fontepargpadro">
     <w:name w:val="Default Paragraph Font"/>
     <w:uiPriority w:val="1"/>
+    <w:semiHidden/>
     <w:unhideWhenUsed/>
   </w:style>
   <w:style w:type="table" w:default="1" w:styleId="Tabelanormal">

</xml_diff>